<commit_message>
Add Tamil infographic, click-to-enlarge lightbox, update concept doc
- Replace English placeholder with proper Tamil infographic
- Add lightbox modal: click any infographic to view full-size
- Update concept document with latest version
- Bump Workbox cache limit for larger infographics

Co-Authored-By: Claude Opus 4.6 <noreply@anthropic.com>
</commit_message>
<xml_diff>
--- a/public/concept-doc.docx
+++ b/public/concept-doc.docx
@@ -3874,7 +3874,7 @@
           <w:sz w:val="22"/>
           <w:szCs w:val="22"/>
         </w:rPr>
-        <w:t xml:space="preserve">SMS/WhatsApp alerts via Twilio or MSG91 — notifies operator of anomalies</w:t>
+        <w:t xml:space="preserve">SMS/WhatsApp alerts via automated notification system — notifies operator of anomalies</w:t>
       </w:r>
     </w:p>
     <w:p>
@@ -6439,7 +6439,7 @@
           <w:sz w:val="22"/>
           <w:szCs w:val="22"/>
         </w:rPr>
-        <w:t xml:space="preserve">This project is intentionally parked until current priorities (MenuMate, AI Concierge) are completed. When ready to activate:</w:t>
+        <w:t xml:space="preserve">This project is intentionally parked until current priorities are completed. When ready to activate:</w:t>
       </w:r>
     </w:p>
     <w:p>
@@ -7060,7 +7060,7 @@
                 <w:sz w:val="21"/>
                 <w:szCs w:val="21"/>
               </w:rPr>
-              <w:t xml:space="preserve">Upon completion of MenuMate and AI Concierge projects</w:t>
+              <w:t xml:space="preserve">Upon completion of current active projects</w:t>
             </w:r>
           </w:p>
         </w:tc>

</xml_diff>